<commit_message>
v2.1: accommodate Richard's follow-up — anchoring definition, prior-file control as frequency scale, firm size demographic
- Instrument v2.1 + synced Qualtrics import/codebook
- Orientation screen with neutral anchoring-bias definition (display only)
- C1 prior-file control converted to frequency scale (varies engagement-by-engagement)
- New demographic D3b firm size (Big 4 / mid-tier / small / sole practitioner)
- Both response docs updated with follow-up dispositions

Co-Authored-By: Claude Opus 4.8 (1M context) <noreply@anthropic.com>
Claude-Session: https://claude.ai/code/session_019uQWfMoV11me5yJ6LYRtPv
</commit_message>
<xml_diff>
--- a/dba/04_Peer_Review/Note_and_Responses_to_Richard_2026-06-21.docx
+++ b/dba/04_Peer_Review/Note_and_Responses_to_Richard_2026-06-21.docx
@@ -303,6 +303,80 @@
       </w:r>
       <w:r>
         <w:t xml:space="preserve"> | The whole anchoring idea assumes the auditor is exposed to the prior-year number. Rather than bend an item, I added a control so the analysis can check whether the effect differs by access. Your question became a testable variable. |</w:t>
+      </w:r>
+    </w:p>
+    <w:p>
+      <w:r>
+        <w:br/>
+      </w:r>
+    </w:p>
+    <w:p>
+      <w:pPr>
+        <w:pStyle w:val="Heading2"/>
+      </w:pPr>
+      <w:r>
+        <w:t>Your follow-up points (from chat) — all done</w:t>
+      </w:r>
+    </w:p>
+    <w:p>
+      <w:r>
+        <w:t>| You added | What I did | Why |</w:t>
+      </w:r>
+    </w:p>
+    <w:p>
+      <w:r>
+        <w:t>|---|---|---|</w:t>
+      </w:r>
+    </w:p>
+    <w:p>
+      <w:r>
+        <w:t xml:space="preserve">| </w:t>
+      </w:r>
+      <w:r>
+        <w:rPr>
+          <w:b/>
+        </w:rPr>
+        <w:t>"Add the definition of anchoring bias."</w:t>
+      </w:r>
+      <w:r>
+        <w:t xml:space="preserve"> | A brief, plain-language definition now appears on an orientation screen right after consent. | Helps every respondent answer from the same understanding. I kept it neutral and general (not tied to any item) so it aids comprehension without nudging answers. |</w:t>
+      </w:r>
+    </w:p>
+    <w:p>
+      <w:r>
+        <w:t xml:space="preserve">| </w:t>
+      </w:r>
+      <w:r>
+        <w:rPr>
+          <w:b/>
+        </w:rPr>
+        <w:t>"Access to previous audit files could vary audit by audit — pursue a control variable."</w:t>
+      </w:r>
+      <w:r>
+        <w:t xml:space="preserve"> | I kept the prior-file control and </w:t>
+      </w:r>
+      <w:r>
+        <w:rPr>
+          <w:b/>
+        </w:rPr>
+        <w:t>changed it to a frequency scale</w:t>
+      </w:r>
+      <w:r>
+        <w:t xml:space="preserve"> — "On every / most / about half / some / rarely-or-never engagement." | You're right it varies engagement-by-engagement, so a single agree/disagree wasn't enough. A frequency scale captures that variation and lets the analysis test whether anchoring differs by how often the team sees the prior file. |</w:t>
+      </w:r>
+    </w:p>
+    <w:p>
+      <w:r>
+        <w:t xml:space="preserve">| </w:t>
+      </w:r>
+      <w:r>
+        <w:rPr>
+          <w:b/>
+        </w:rPr>
+        <w:t>"Add firm size — Big 4 / mid-tier / small."</w:t>
+      </w:r>
+      <w:r>
+        <w:t xml:space="preserve"> | New demographic added: Big 4 / Mid-tier / Small / Sole practitioner, separate from organization type. | Firm scale is a meaningful control that organization type alone didn't capture. |</w:t>
       </w:r>
     </w:p>
     <w:p>

</xml_diff>